<commit_message>
Update membership application form
</commit_message>
<xml_diff>
--- a/MAU_DON_XIN_GIA_NHAP_CLB/MAU_DON_XIN_GIA_NHAP_CLB_SRC_FINAL.docx
+++ b/MAU_DON_XIN_GIA_NHAP_CLB/MAU_DON_XIN_GIA_NHAP_CLB_SRC_FINAL.docx
@@ -98,6 +98,7 @@
               <w:jc w:val="center"/>
               <w:rPr>
                 <w:color w:val="000000" w:themeColor="text1"/>
+                <w:lang w:val="vi-VN"/>
               </w:rPr>
             </w:pPr>
             <w:r>
@@ -105,6 +106,7 @@
                 <w:b/>
                 <w:color w:val="000000" w:themeColor="text1"/>
                 <w:sz w:val="24"/>
+                <w:lang w:val="vi-VN"/>
               </w:rPr>
               <w:t>CỘNG HÒA XÃ HỘI CHỦ NGHĨA VIỆT NAM</w:t>
             </w:r>
@@ -821,6 +823,7 @@
         <w:jc w:val="both"/>
         <w:rPr>
           <w:color w:val="000000" w:themeColor="text1"/>
+          <w:lang w:val="vi-VN"/>
         </w:rPr>
       </w:pPr>
       <w:r>
@@ -828,7 +831,81 @@
           <w:color w:val="000000" w:themeColor="text1"/>
           <w:sz w:val="24"/>
         </w:rPr>
-        <w:t>[  ] Giáo dục và khoa học sư phạm      [  ] Kinh tế - Quản lý      [  ] Luật - Khoa học xã hội</w:t>
+        <w:t xml:space="preserve">[  ] </w:t>
+      </w:r>
+      <w:r>
+        <w:rPr>
+          <w:color w:val="000000" w:themeColor="text1"/>
+          <w:sz w:val="24"/>
+        </w:rPr>
+        <w:t>Tự</w:t>
+      </w:r>
+      <w:r>
+        <w:rPr>
+          <w:color w:val="000000" w:themeColor="text1"/>
+          <w:sz w:val="24"/>
+          <w:lang w:val="vi-VN"/>
+        </w:rPr>
+        <w:t xml:space="preserve"> nhiên                     </w:t>
+      </w:r>
+      <w:r>
+        <w:rPr>
+          <w:color w:val="000000" w:themeColor="text1"/>
+          <w:sz w:val="24"/>
+        </w:rPr>
+        <w:t xml:space="preserve">[  ] </w:t>
+      </w:r>
+      <w:r>
+        <w:rPr>
+          <w:color w:val="000000" w:themeColor="text1"/>
+          <w:sz w:val="24"/>
+        </w:rPr>
+        <w:t>Xã</w:t>
+      </w:r>
+      <w:r>
+        <w:rPr>
+          <w:color w:val="000000" w:themeColor="text1"/>
+          <w:sz w:val="24"/>
+          <w:lang w:val="vi-VN"/>
+        </w:rPr>
+        <w:t xml:space="preserve"> hội Nhân văn</w:t>
+      </w:r>
+      <w:r>
+        <w:rPr>
+          <w:color w:val="000000" w:themeColor="text1"/>
+          <w:sz w:val="24"/>
+        </w:rPr>
+        <w:t xml:space="preserve">      </w:t>
+      </w:r>
+      <w:r>
+        <w:rPr>
+          <w:color w:val="000000" w:themeColor="text1"/>
+          <w:sz w:val="24"/>
+          <w:lang w:val="vi-VN"/>
+        </w:rPr>
+        <w:t xml:space="preserve">                </w:t>
+      </w:r>
+      <w:r>
+        <w:rPr>
+          <w:color w:val="000000" w:themeColor="text1"/>
+          <w:sz w:val="24"/>
+        </w:rPr>
+        <w:t xml:space="preserve">[  ] </w:t>
+      </w:r>
+      <w:r>
+        <w:rPr>
+          <w:color w:val="000000" w:themeColor="text1"/>
+          <w:sz w:val="24"/>
+        </w:rPr>
+        <w:t>Giáo</w:t>
+      </w:r>
+      <w:r>
+        <w:rPr>
+          <w:color w:val="000000" w:themeColor="text1"/>
+          <w:sz w:val="24"/>
+          <w:lang w:val="vi-VN"/>
+        </w:rPr>
+        <w:t xml:space="preserve"> dục</w:t>
       </w:r>
     </w:p>
     <w:p>
@@ -838,14 +915,16 @@
         <w:jc w:val="both"/>
         <w:rPr>
           <w:color w:val="000000" w:themeColor="text1"/>
+          <w:lang w:val="vi-VN"/>
         </w:rPr>
       </w:pPr>
       <w:r>
         <w:rPr>
           <w:color w:val="000000" w:themeColor="text1"/>
           <w:sz w:val="24"/>
+          <w:lang w:val="vi-VN"/>
         </w:rPr>
-        <w:t xml:space="preserve">[  ] Công nghệ thông tin - AI        </w:t>
+        <w:t xml:space="preserve">[  ] </w:t>
       </w:r>
       <w:r>
         <w:rPr>
@@ -853,14 +932,31 @@
           <w:sz w:val="24"/>
           <w:lang w:val="vi-VN"/>
         </w:rPr>
-        <w:t xml:space="preserve">    </w:t>
+        <w:t>Kĩ</w:t>
       </w:r>
       <w:r>
         <w:rPr>
           <w:color w:val="000000" w:themeColor="text1"/>
           <w:sz w:val="24"/>
+          <w:lang w:val="vi-VN"/>
         </w:rPr>
-        <w:t xml:space="preserve">   [  ] Khởi nghiệp - Đổi mới sáng tạo</w:t>
+        <w:t xml:space="preserve"> thuật                       </w:t>
+      </w:r>
+      <w:r>
+        <w:rPr>
+          <w:color w:val="000000" w:themeColor="text1"/>
+          <w:sz w:val="24"/>
+          <w:lang w:val="vi-VN"/>
+        </w:rPr>
+        <w:t xml:space="preserve">[  ] </w:t>
+      </w:r>
+      <w:r>
+        <w:rPr>
+          <w:color w:val="000000" w:themeColor="text1"/>
+          <w:sz w:val="24"/>
+          <w:lang w:val="vi-VN"/>
+        </w:rPr>
+        <w:t>MT cơ sở</w:t>
       </w:r>
     </w:p>
     <w:p>
@@ -921,7 +1017,7 @@
           <w:color w:val="000000" w:themeColor="text1"/>
           <w:sz w:val="24"/>
         </w:rPr>
-        <w:t xml:space="preserve">[  ] Tin học văn phòng   </w:t>
+        <w:t>[  ] Tin học văn phòng</w:t>
       </w:r>
       <w:r>
         <w:rPr>
@@ -929,14 +1025,14 @@
           <w:sz w:val="24"/>
           <w:lang w:val="vi-VN"/>
         </w:rPr>
-        <w:t xml:space="preserve"> </w:t>
+        <w:t xml:space="preserve">               </w:t>
       </w:r>
       <w:r>
         <w:rPr>
           <w:color w:val="000000" w:themeColor="text1"/>
           <w:sz w:val="24"/>
         </w:rPr>
-        <w:t xml:space="preserve">  [  ] Thiết kế/Truyền thông      [  ] Thuyết trình</w:t>
+        <w:t>[  ] Thiết kế/Truyền thông      [  ] Thuyết trình</w:t>
       </w:r>
     </w:p>
     <w:p>
@@ -982,6 +1078,14 @@
         <w:rPr>
           <w:color w:val="000000" w:themeColor="text1"/>
           <w:sz w:val="24"/>
+          <w:lang w:val="vi-VN"/>
+        </w:rPr>
+        <w:t xml:space="preserve">          </w:t>
+      </w:r>
+      <w:r>
+        <w:rPr>
+          <w:color w:val="000000" w:themeColor="text1"/>
+          <w:sz w:val="24"/>
         </w:rPr>
         <w:t xml:space="preserve"> [  ] Sử dụng AI                </w:t>
       </w:r>
@@ -998,7 +1102,7 @@
           <w:color w:val="000000" w:themeColor="text1"/>
           <w:sz w:val="24"/>
         </w:rPr>
-        <w:t xml:space="preserve"> [  ] Tổ chức sự kiện</w:t>
+        <w:t>[  ] Tổ chức sự kiện</w:t>
       </w:r>
     </w:p>
     <w:p>
@@ -1045,6 +1149,14 @@
         <w:rPr>
           <w:color w:val="000000" w:themeColor="text1"/>
           <w:sz w:val="24"/>
+          <w:lang w:val="vi-VN"/>
+        </w:rPr>
+        <w:t xml:space="preserve">          </w:t>
+      </w:r>
+      <w:r>
+        <w:rPr>
+          <w:color w:val="000000" w:themeColor="text1"/>
+          <w:sz w:val="24"/>
         </w:rPr>
         <w:t xml:space="preserve">[  ] Ngoại ngữ                 </w:t>
       </w:r>
@@ -1061,7 +1173,7 @@
           <w:color w:val="000000" w:themeColor="text1"/>
           <w:sz w:val="24"/>
         </w:rPr>
-        <w:t xml:space="preserve"> [  ] Khác: ............................................</w:t>
+        <w:t>[  ] Khác: ................................</w:t>
       </w:r>
       <w:r>
         <w:rPr>
@@ -1069,7 +1181,7 @@
           <w:sz w:val="24"/>
           <w:lang w:val="vi-VN"/>
         </w:rPr>
-        <w:t>.</w:t>
+        <w:t>....</w:t>
       </w:r>
     </w:p>
     <w:p>
@@ -1293,41 +1405,6 @@
     </w:p>
     <w:p>
       <w:pPr>
-        <w:spacing w:after="0"/>
-        <w:ind w:left="397"/>
-        <w:jc w:val="both"/>
-        <w:rPr>
-          <w:color w:val="000000" w:themeColor="text1"/>
-        </w:rPr>
-      </w:pPr>
-      <w:r>
-        <w:rPr>
-          <w:color w:val="000000" w:themeColor="text1"/>
-          <w:sz w:val="24"/>
-        </w:rPr>
-        <w:lastRenderedPageBreak/>
-        <w:t>........................................................................................................................................................</w:t>
-      </w:r>
-    </w:p>
-    <w:p>
-      <w:pPr>
-        <w:spacing w:after="0"/>
-        <w:ind w:left="397"/>
-        <w:jc w:val="both"/>
-        <w:rPr>
-          <w:color w:val="000000" w:themeColor="text1"/>
-        </w:rPr>
-      </w:pPr>
-      <w:r>
-        <w:rPr>
-          <w:color w:val="000000" w:themeColor="text1"/>
-          <w:sz w:val="24"/>
-        </w:rPr>
-        <w:t>........................................................................................................................................................</w:t>
-      </w:r>
-    </w:p>
-    <w:p>
-      <w:pPr>
         <w:spacing w:before="40" w:after="20"/>
         <w:ind w:left="113"/>
         <w:jc w:val="both"/>
@@ -1341,6 +1418,7 @@
           <w:color w:val="000000" w:themeColor="text1"/>
           <w:sz w:val="25"/>
         </w:rPr>
+        <w:lastRenderedPageBreak/>
         <w:t>2. Mong muốn được tham gia/hỗ trợ ở nhóm hoạt động:</w:t>
       </w:r>
     </w:p>
@@ -1461,21 +1539,7 @@
           <w:color w:val="000000" w:themeColor="text1"/>
           <w:sz w:val="24"/>
         </w:rPr>
-        <w:t>........................................................................................................................................................</w:t>
-      </w:r>
-      <w:r>
-        <w:rPr>
-          <w:color w:val="000000" w:themeColor="text1"/>
-          <w:sz w:val="24"/>
-        </w:rPr>
-        <w:t xml:space="preserve"> </w:t>
-      </w:r>
-      <w:r>
-        <w:rPr>
-          <w:color w:val="000000" w:themeColor="text1"/>
-          <w:sz w:val="24"/>
-        </w:rPr>
-        <w:t>........................................................................................................................................................</w:t>
+        <w:t>........................................................................................................................................................ ........................................................................................................................................................</w:t>
       </w:r>
     </w:p>
     <w:p>
@@ -1828,7 +1892,7 @@
                 <w:color w:val="000000" w:themeColor="text1"/>
                 <w:sz w:val="24"/>
               </w:rPr>
-              <w:t>TM</w:t>
+              <w:t>Phó</w:t>
             </w:r>
             <w:r>
               <w:rPr>
@@ -1837,7 +1901,7 @@
                 <w:sz w:val="24"/>
                 <w:lang w:val="vi-VN"/>
               </w:rPr>
-              <w:t xml:space="preserve">. </w:t>
+              <w:t xml:space="preserve"> </w:t>
             </w:r>
             <w:r>
               <w:rPr>
@@ -1845,7 +1909,7 @@
                 <w:color w:val="000000" w:themeColor="text1"/>
                 <w:sz w:val="24"/>
               </w:rPr>
-              <w:t>Ban Chủ nhiệm CLB</w:t>
+              <w:t>Chủ nhiệm CLB</w:t>
             </w:r>
           </w:p>
           <w:p>
@@ -1921,7 +1985,20 @@
               <w:spacing w:after="0" w:line="240" w:lineRule="auto"/>
               <w:jc w:val="center"/>
               <w:rPr>
+                <w:i/>
                 <w:color w:val="000000" w:themeColor="text1"/>
+                <w:sz w:val="22"/>
+                <w:lang w:val="vi-VN"/>
+              </w:rPr>
+            </w:pPr>
+          </w:p>
+          <w:p>
+            <w:pPr>
+              <w:spacing w:after="0" w:line="240" w:lineRule="auto"/>
+              <w:jc w:val="center"/>
+              <w:rPr>
+                <w:color w:val="000000" w:themeColor="text1"/>
+                <w:szCs w:val="26"/>
                 <w:lang w:val="vi-VN"/>
               </w:rPr>
             </w:pPr>
@@ -1931,10 +2008,10 @@
                 <w:bCs/>
                 <w:iCs/>
                 <w:color w:val="000000" w:themeColor="text1"/>
-                <w:sz w:val="22"/>
+                <w:szCs w:val="26"/>
                 <w:lang w:val="vi-VN"/>
               </w:rPr>
-              <w:t>ThS. Nông Thị Hoài Thương</w:t>
+              <w:t>Ma Văn Long</w:t>
             </w:r>
           </w:p>
         </w:tc>
@@ -1954,6 +2031,7 @@
               <w:jc w:val="center"/>
               <w:rPr>
                 <w:color w:val="000000" w:themeColor="text1"/>
+                <w:lang w:val="vi-VN"/>
               </w:rPr>
             </w:pPr>
             <w:r>
@@ -1961,6 +2039,7 @@
                 <w:i/>
                 <w:color w:val="000000" w:themeColor="text1"/>
                 <w:sz w:val="23"/>
+                <w:lang w:val="vi-VN"/>
               </w:rPr>
               <w:t>Tuyên</w:t>
             </w:r>
@@ -1978,8 +2057,18 @@
                 <w:i/>
                 <w:color w:val="000000" w:themeColor="text1"/>
                 <w:sz w:val="23"/>
+                <w:lang w:val="vi-VN"/>
               </w:rPr>
-              <w:t>, ngày ...... tháng ...... năm ........</w:t>
+              <w:t xml:space="preserve">, ngày ...... tháng ...... năm </w:t>
+            </w:r>
+            <w:r>
+              <w:rPr>
+                <w:i/>
+                <w:color w:val="000000" w:themeColor="text1"/>
+                <w:sz w:val="23"/>
+                <w:lang w:val="vi-VN"/>
+              </w:rPr>
+              <w:t>2026</w:t>
             </w:r>
           </w:p>
           <w:p>
@@ -1988,6 +2077,7 @@
               <w:jc w:val="center"/>
               <w:rPr>
                 <w:color w:val="000000" w:themeColor="text1"/>
+                <w:lang w:val="vi-VN"/>
               </w:rPr>
             </w:pPr>
             <w:r>
@@ -1995,6 +2085,7 @@
                 <w:b/>
                 <w:color w:val="000000" w:themeColor="text1"/>
                 <w:sz w:val="25"/>
+                <w:lang w:val="vi-VN"/>
               </w:rPr>
               <w:t>NGƯỜI LÀM ĐƠN</w:t>
             </w:r>
@@ -2005,6 +2096,7 @@
               <w:jc w:val="center"/>
               <w:rPr>
                 <w:color w:val="000000" w:themeColor="text1"/>
+                <w:lang w:val="vi-VN"/>
               </w:rPr>
             </w:pPr>
             <w:r>
@@ -2012,6 +2104,7 @@
                 <w:i/>
                 <w:color w:val="000000" w:themeColor="text1"/>
                 <w:sz w:val="22"/>
+                <w:lang w:val="vi-VN"/>
               </w:rPr>
               <w:t>(Ký và ghi rõ họ tên)</w:t>
             </w:r>
@@ -2021,6 +2114,7 @@
               <w:spacing w:after="0" w:line="240" w:lineRule="auto"/>
               <w:rPr>
                 <w:color w:val="000000" w:themeColor="text1"/>
+                <w:lang w:val="vi-VN"/>
               </w:rPr>
             </w:pPr>
           </w:p>
@@ -2151,6 +2245,7 @@
         </v:shapetype>
         <v:shape id="WordPictureWatermark7234626" o:spid="_x0000_s1026" type="#_x0000_t75" style="position:absolute;margin-left:0;margin-top:0;width:476.15pt;height:476.15pt;z-index:-251657216;mso-position-horizontal:center;mso-position-horizontal-relative:margin;mso-position-vertical:center;mso-position-vertical-relative:margin" o:allowincell="f">
           <v:imagedata r:id="rId1" o:title="Logo" gain="19661f" blacklevel="22938f"/>
+          <w10:wrap anchorx="margin" anchory="margin"/>
         </v:shape>
       </w:pict>
     </w:r>
@@ -2202,6 +2297,7 @@
         </v:shapetype>
         <v:shape id="WordPictureWatermark7234627" o:spid="_x0000_s1027" type="#_x0000_t75" style="position:absolute;left:0;text-align:left;margin-left:0;margin-top:0;width:476.15pt;height:476.15pt;z-index:-251656192;mso-position-horizontal:center;mso-position-horizontal-relative:margin;mso-position-vertical:center;mso-position-vertical-relative:margin" o:allowincell="f">
           <v:imagedata r:id="rId1" o:title="Logo" gain="19661f" blacklevel="22938f"/>
+          <w10:wrap anchorx="margin" anchory="margin"/>
         </v:shape>
       </w:pict>
     </w:r>
@@ -2241,6 +2337,7 @@
         </v:shapetype>
         <v:shape id="WordPictureWatermark7234625" o:spid="_x0000_s1025" type="#_x0000_t75" style="position:absolute;margin-left:0;margin-top:0;width:476.15pt;height:476.15pt;z-index:-251658240;mso-position-horizontal:center;mso-position-horizontal-relative:margin;mso-position-vertical:center;mso-position-vertical-relative:margin" o:allowincell="f">
           <v:imagedata r:id="rId1" o:title="Logo" gain="19661f" blacklevel="22938f"/>
+          <w10:wrap anchorx="margin" anchory="margin"/>
         </v:shape>
       </w:pict>
     </w:r>

</xml_diff>